<commit_message>
add resumes, job tracker updates, phase readout, memory mirror updates
- New resumes: LASR, NVIDIA, OpenAI (interp + general)
- Job tracker: march2026 canonical tracker + intermediate drafts
- phase_readout/: new project directory (instructions, notes, PDF)
- memory_mirror: add fellows app, feedback files; update MEMORY.md, research_ideas, lit-review, idea_qk_metric
- anthropic resume: minor update

Co-Authored-By: Claude Sonnet 4.6 <noreply@anthropic.com>
</commit_message>
<xml_diff>
--- a/notebooks/anthropic_app/resumes/Fields_Peter_Resume_anthropic_final.docx
+++ b/notebooks/anthropic_app/resumes/Fields_Peter_Resume_anthropic_final.docx
@@ -250,20 +250,6 @@
       </w:r>
       <w:r>
         <w:t xml:space="preserve"> 2026</w:t>
-      </w:r>
-    </w:p>
-    <w:p>
-      <w:pPr>
-        <w:spacing w:after="20" w:line="250" w:lineRule="auto"/>
-      </w:pPr>
-      <w:r>
-        <w:rPr>
-          <w:i/>
-          <w:iCs/>
-          <w:sz w:val="19"/>
-          <w:szCs w:val="19"/>
-        </w:rPr>
-        <w:t>Dissertation submitted; defense completed</w:t>
       </w:r>
     </w:p>
     <w:p>
@@ -768,8 +754,6 @@
           <w:bottom w:val="single" w:sz="6" w:space="1" w:color="555555"/>
         </w:pBdr>
         <w:spacing w:before="200" w:after="80"/>
-      </w:pPr>
-      <w:r>
         <w:rPr>
           <w:b/>
           <w:bCs/>
@@ -777,6 +761,39 @@
           <w:sz w:val="23"/>
           <w:szCs w:val="23"/>
         </w:rPr>
+      </w:pPr>
+    </w:p>
+    <w:p>
+      <w:pPr>
+        <w:pBdr>
+          <w:bottom w:val="single" w:sz="6" w:space="1" w:color="555555"/>
+        </w:pBdr>
+        <w:spacing w:before="200" w:after="80"/>
+        <w:rPr>
+          <w:b/>
+          <w:bCs/>
+          <w:smallCaps/>
+          <w:sz w:val="23"/>
+          <w:szCs w:val="23"/>
+        </w:rPr>
+      </w:pPr>
+    </w:p>
+    <w:p>
+      <w:pPr>
+        <w:pBdr>
+          <w:bottom w:val="single" w:sz="6" w:space="1" w:color="555555"/>
+        </w:pBdr>
+        <w:spacing w:before="200" w:after="80"/>
+      </w:pPr>
+      <w:r>
+        <w:rPr>
+          <w:b/>
+          <w:bCs/>
+          <w:smallCaps/>
+          <w:sz w:val="23"/>
+          <w:szCs w:val="23"/>
+        </w:rPr>
+        <w:lastRenderedPageBreak/>
         <w:t>EXPERIENCE</w:t>
       </w:r>
     </w:p>
@@ -812,7 +829,6 @@
           <w:sz w:val="19"/>
           <w:szCs w:val="19"/>
         </w:rPr>
-        <w:lastRenderedPageBreak/>
         <w:t>Data-driven modeling of proteins and neural-like systems using statistical physics and machine learning methods</w:t>
       </w:r>
     </w:p>
@@ -1012,8 +1028,13 @@
       </w:r>
       <w:proofErr w:type="spellEnd"/>
       <w:r>
-        <w:t>, TransformerLens</w:t>
-      </w:r>
+        <w:t xml:space="preserve">, </w:t>
+      </w:r>
+      <w:proofErr w:type="spellStart"/>
+      <w:r>
+        <w:t>TransformerLens</w:t>
+      </w:r>
+      <w:proofErr w:type="spellEnd"/>
       <w:r>
         <w:t xml:space="preserve">), Mathematica, Unix/CLI, LaTeX, Git, </w:t>
       </w:r>

</xml_diff>